<commit_message>
Fix association directions, Parcel connectors and integration notes wording
</commit_message>
<xml_diff>
--- a/Documents/COE420_Lab5_Team10.docx
+++ b/Documents/COE420_Lab5_Team10.docx
@@ -517,7 +517,7 @@
           <w:sz w:val="22"/>
           <w:szCs w:val="22"/>
         </w:rPr>
-        <w:t xml:space="preserve">Each member first modeled the part of the system they owned in Labs 3 and 4, then the team merged the four models into one consolidated class diagram. Every member pushed their own work to the shared GitHub repository.</w:t>
+        <w:t xml:space="preserve">Each member first modeled the part of the system they owned in Labs 3 and 4, then the team merged the four models into one consolidated class diagram. Every member pushed their own work to the shared GitHub repository, and the final integration fixes were committed together at the end.</w:t>
       </w:r>
     </w:p>
     <w:tbl>
@@ -13139,7 +13139,7 @@
                 <w:sz w:val="18"/>
                 <w:szCs w:val="18"/>
               </w:rPr>
-              <w:t xml:space="preserve">Added Parcel.senderAddress, and Customer.bookParcel() now takes senderAddress and senderEmirate; booking collects both (see section 6)</w:t>
+              <w:t xml:space="preserve">Added Parcel.senderAddress, and Customer.bookParcel() now takes senderAddress and senderEmirate; booking collects both (see the updates to previous labs)</w:t>
             </w:r>
           </w:p>
         </w:tc>
@@ -16330,7 +16330,7 @@
           <w:sz w:val="22"/>
           <w:szCs w:val="22"/>
         </w:rPr>
-        <w:t xml:space="preserve">Each member committed their own work under their own GitHub account.</w:t>
+        <w:t xml:space="preserve">Each member committed their own individual model, inventory and team task under their own GitHub account. The final integration fixes listed in Integration_Notes.md (diagram tidy-ups, file moves and the consolidated diagram clean-up) were committed together by Sarhan on October 27.</w:t>
       </w:r>
     </w:p>
     <w:p>

</xml_diff>

<commit_message>
Final review fixes: traceability, decisions 13-14, notes, README, diagram tidy-ups
</commit_message>
<xml_diff>
--- a/Documents/COE420_Lab5_Team10.docx
+++ b/Documents/COE420_Lab5_Team10.docx
@@ -5401,7 +5401,7 @@
                 <w:sz w:val="19"/>
                 <w:szCs w:val="19"/>
               </w:rPr>
-              <w:t xml:space="preserve">UC-01, UC-03, UC-05</w:t>
+              <w:t xml:space="preserve">UC-01, UC-03, UC-05, UC-19</w:t>
             </w:r>
           </w:p>
         </w:tc>
@@ -5551,7 +5551,7 @@
                 <w:sz w:val="19"/>
                 <w:szCs w:val="19"/>
               </w:rPr>
-              <w:t xml:space="preserve">UC-03, UC-04, UC-05, UC-14, UC-19, UC-21</w:t>
+              <w:t xml:space="preserve">UC-03, UC-04, UC-05, UC-14, UC-15, UC-19, UC-21</w:t>
             </w:r>
           </w:p>
         </w:tc>
@@ -10019,7 +10019,7 @@
                 <w:sz w:val="18"/>
                 <w:szCs w:val="18"/>
               </w:rPr>
-              <w:t xml:space="preserve">ProofOfDelivery used a proof image (proofImagePath), and a leftover recievedByName attribute</w:t>
+              <w:t xml:space="preserve">ProofOfDelivery used a proof image (proofImagePath), and a leftover recievedByName (sic) attribute</w:t>
             </w:r>
           </w:p>
         </w:tc>
@@ -10441,7 +10441,7 @@
                 <w:sz w:val="18"/>
                 <w:szCs w:val="18"/>
               </w:rPr>
-              <w:t xml:space="preserve">Standardised to </w:t>
+              <w:t xml:space="preserve">In the consolidated diagram, standardised to </w:t>
             </w:r>
             <w:r>
               <w:rPr>
@@ -10511,6 +10511,348 @@
                 <w:szCs w:val="18"/>
               </w:rPr>
               <w:t xml:space="preserve">One consistent style across the whole diagram.</w:t>
+            </w:r>
+          </w:p>
+        </w:tc>
+      </w:tr>
+      <w:tr>
+        <w:trPr>
+          <w:tblHeader w:val="false"/>
+        </w:trPr>
+        <w:tc>
+          <w:tcPr>
+            <w:tcW w:type="dxa" w:w="400"/>
+            <w:tcBorders>
+              <w:top w:val="single" w:color="999999" w:sz="4"/>
+              <w:left w:val="single" w:color="999999" w:sz="4"/>
+              <w:bottom w:val="single" w:color="999999" w:sz="4"/>
+              <w:right w:val="single" w:color="999999" w:sz="4"/>
+            </w:tcBorders>
+            <w:tcMar>
+              <w:top w:type="dxa" w:w="60"/>
+              <w:left w:type="dxa" w:w="100"/>
+              <w:bottom w:type="dxa" w:w="60"/>
+              <w:right w:type="dxa" w:w="100"/>
+            </w:tcMar>
+          </w:tcPr>
+          <w:p>
+            <w:r>
+              <w:rPr>
+                <w:rFonts w:ascii="Calibri" w:cs="Calibri" w:eastAsia="Calibri" w:hAnsi="Calibri"/>
+                <w:b w:val="false"/>
+                <w:bCs w:val="false"/>
+                <w:sz w:val="18"/>
+                <w:szCs w:val="18"/>
+              </w:rPr>
+              <w:t xml:space="preserve">13</w:t>
+            </w:r>
+          </w:p>
+        </w:tc>
+        <w:tc>
+          <w:tcPr>
+            <w:tcW w:type="dxa" w:w="2500"/>
+            <w:tcBorders>
+              <w:top w:val="single" w:color="999999" w:sz="4"/>
+              <w:left w:val="single" w:color="999999" w:sz="4"/>
+              <w:bottom w:val="single" w:color="999999" w:sz="4"/>
+              <w:right w:val="single" w:color="999999" w:sz="4"/>
+            </w:tcBorders>
+            <w:tcMar>
+              <w:top w:type="dxa" w:w="60"/>
+              <w:left w:type="dxa" w:w="100"/>
+              <w:bottom w:type="dxa" w:w="60"/>
+              <w:right w:type="dxa" w:w="100"/>
+            </w:tcMar>
+          </w:tcPr>
+          <w:p>
+            <w:r>
+              <w:rPr>
+                <w:rFonts w:ascii="Calibri" w:cs="Calibri" w:eastAsia="Calibri" w:hAnsi="Calibri"/>
+                <w:b w:val="false"/>
+                <w:bCs w:val="false"/>
+                <w:sz w:val="18"/>
+                <w:szCs w:val="18"/>
+              </w:rPr>
+              <w:t xml:space="preserve">Some association names differed between the individual diagrams and read less clearly as phrases</w:t>
+            </w:r>
+          </w:p>
+        </w:tc>
+        <w:tc>
+          <w:tcPr>
+            <w:tcW w:type="dxa" w:w="2600"/>
+            <w:tcBorders>
+              <w:top w:val="single" w:color="999999" w:sz="4"/>
+              <w:left w:val="single" w:color="999999" w:sz="4"/>
+              <w:bottom w:val="single" w:color="999999" w:sz="4"/>
+              <w:right w:val="single" w:color="999999" w:sz="4"/>
+            </w:tcBorders>
+            <w:tcMar>
+              <w:top w:type="dxa" w:w="60"/>
+              <w:left w:type="dxa" w:w="100"/>
+              <w:bottom w:type="dxa" w:w="60"/>
+              <w:right w:type="dxa" w:w="100"/>
+            </w:tcMar>
+          </w:tcPr>
+          <w:p>
+            <w:r>
+              <w:rPr>
+                <w:rFonts w:ascii="Calibri" w:cs="Calibri" w:eastAsia="Calibri" w:hAnsi="Calibri"/>
+                <w:b w:val="false"/>
+                <w:bCs w:val="false"/>
+                <w:sz w:val="18"/>
+                <w:szCs w:val="18"/>
+              </w:rPr>
+              <w:t xml:space="preserve">Renamed in the consolidated diagram: recipient → </w:t>
+            </w:r>
+            <w:r>
+              <w:rPr>
+                <w:rFonts w:ascii="Calibri" w:cs="Calibri" w:eastAsia="Calibri" w:hAnsi="Calibri"/>
+                <w:b/>
+                <w:bCs/>
+                <w:sz w:val="18"/>
+                <w:szCs w:val="18"/>
+              </w:rPr>
+              <w:t xml:space="preserve">is sent to</w:t>
+            </w:r>
+            <w:r>
+              <w:rPr>
+                <w:rFonts w:ascii="Calibri" w:cs="Calibri" w:eastAsia="Calibri" w:hAnsi="Calibri"/>
+                <w:b w:val="false"/>
+                <w:bCs w:val="false"/>
+                <w:sz w:val="18"/>
+                <w:szCs w:val="18"/>
+              </w:rPr>
+              <w:t xml:space="preserve">, about parcel → </w:t>
+            </w:r>
+            <w:r>
+              <w:rPr>
+                <w:rFonts w:ascii="Calibri" w:cs="Calibri" w:eastAsia="Calibri" w:hAnsi="Calibri"/>
+                <w:b/>
+                <w:bCs/>
+                <w:sz w:val="18"/>
+                <w:szCs w:val="18"/>
+              </w:rPr>
+              <w:t xml:space="preserve">is about</w:t>
+            </w:r>
+            <w:r>
+              <w:rPr>
+                <w:rFonts w:ascii="Calibri" w:cs="Calibri" w:eastAsia="Calibri" w:hAnsi="Calibri"/>
+                <w:b w:val="false"/>
+                <w:bCs w:val="false"/>
+                <w:sz w:val="18"/>
+                <w:szCs w:val="18"/>
+              </w:rPr>
+              <w:t xml:space="preserve">, history of → </w:t>
+            </w:r>
+            <w:r>
+              <w:rPr>
+                <w:rFonts w:ascii="Calibri" w:cs="Calibri" w:eastAsia="Calibri" w:hAnsi="Calibri"/>
+                <w:b/>
+                <w:bCs/>
+                <w:sz w:val="18"/>
+                <w:szCs w:val="18"/>
+              </w:rPr>
+              <w:t xml:space="preserve">records change of</w:t>
+            </w:r>
+            <w:r>
+              <w:rPr>
+                <w:rFonts w:ascii="Calibri" w:cs="Calibri" w:eastAsia="Calibri" w:hAnsi="Calibri"/>
+                <w:b w:val="false"/>
+                <w:bCs w:val="false"/>
+                <w:sz w:val="18"/>
+                <w:szCs w:val="18"/>
+              </w:rPr>
+              <w:t xml:space="preserve">, actor → </w:t>
+            </w:r>
+            <w:r>
+              <w:rPr>
+                <w:rFonts w:ascii="Calibri" w:cs="Calibri" w:eastAsia="Calibri" w:hAnsi="Calibri"/>
+                <w:b/>
+                <w:bCs/>
+                <w:sz w:val="18"/>
+                <w:szCs w:val="18"/>
+              </w:rPr>
+              <w:t xml:space="preserve">made by</w:t>
+            </w:r>
+            <w:r>
+              <w:rPr>
+                <w:rFonts w:ascii="Calibri" w:cs="Calibri" w:eastAsia="Calibri" w:hAnsi="Calibri"/>
+                <w:b w:val="false"/>
+                <w:bCs w:val="false"/>
+                <w:sz w:val="18"/>
+                <w:szCs w:val="18"/>
+              </w:rPr>
+              <w:t xml:space="preserve">, given to → </w:t>
+            </w:r>
+            <w:r>
+              <w:rPr>
+                <w:rFonts w:ascii="Calibri" w:cs="Calibri" w:eastAsia="Calibri" w:hAnsi="Calibri"/>
+                <w:b/>
+                <w:bCs/>
+                <w:sz w:val="18"/>
+                <w:szCs w:val="18"/>
+              </w:rPr>
+              <w:t xml:space="preserve">is given to</w:t>
+            </w:r>
+          </w:p>
+        </w:tc>
+        <w:tc>
+          <w:tcPr>
+            <w:tcW w:type="dxa" w:w="3526"/>
+            <w:tcBorders>
+              <w:top w:val="single" w:color="999999" w:sz="4"/>
+              <w:left w:val="single" w:color="999999" w:sz="4"/>
+              <w:bottom w:val="single" w:color="999999" w:sz="4"/>
+              <w:right w:val="single" w:color="999999" w:sz="4"/>
+            </w:tcBorders>
+            <w:tcMar>
+              <w:top w:type="dxa" w:w="60"/>
+              <w:left w:type="dxa" w:w="100"/>
+              <w:bottom w:type="dxa" w:w="60"/>
+              <w:right w:type="dxa" w:w="100"/>
+            </w:tcMar>
+          </w:tcPr>
+          <w:p>
+            <w:r>
+              <w:rPr>
+                <w:rFonts w:ascii="Calibri" w:cs="Calibri" w:eastAsia="Calibri" w:hAnsi="Calibri"/>
+                <w:b w:val="false"/>
+                <w:bCs w:val="false"/>
+                <w:sz w:val="18"/>
+                <w:szCs w:val="18"/>
+              </w:rPr>
+              <w:t xml:space="preserve">Each association now reads as a sentence from source to target (e.g. "StatusHistoryEntry made by User"). The multiplicities and meaning are unchanged.</w:t>
+            </w:r>
+          </w:p>
+        </w:tc>
+      </w:tr>
+      <w:tr>
+        <w:trPr>
+          <w:tblHeader w:val="false"/>
+        </w:trPr>
+        <w:tc>
+          <w:tcPr>
+            <w:tcW w:type="dxa" w:w="400"/>
+            <w:tcBorders>
+              <w:top w:val="single" w:color="999999" w:sz="4"/>
+              <w:left w:val="single" w:color="999999" w:sz="4"/>
+              <w:bottom w:val="single" w:color="999999" w:sz="4"/>
+              <w:right w:val="single" w:color="999999" w:sz="4"/>
+            </w:tcBorders>
+            <w:tcMar>
+              <w:top w:type="dxa" w:w="60"/>
+              <w:left w:type="dxa" w:w="100"/>
+              <w:bottom w:type="dxa" w:w="60"/>
+              <w:right w:type="dxa" w:w="100"/>
+            </w:tcMar>
+          </w:tcPr>
+          <w:p>
+            <w:r>
+              <w:rPr>
+                <w:rFonts w:ascii="Calibri" w:cs="Calibri" w:eastAsia="Calibri" w:hAnsi="Calibri"/>
+                <w:b w:val="false"/>
+                <w:bCs w:val="false"/>
+                <w:sz w:val="18"/>
+                <w:szCs w:val="18"/>
+              </w:rPr>
+              <w:t xml:space="preserve">14</w:t>
+            </w:r>
+          </w:p>
+        </w:tc>
+        <w:tc>
+          <w:tcPr>
+            <w:tcW w:type="dxa" w:w="2500"/>
+            <w:tcBorders>
+              <w:top w:val="single" w:color="999999" w:sz="4"/>
+              <w:left w:val="single" w:color="999999" w:sz="4"/>
+              <w:bottom w:val="single" w:color="999999" w:sz="4"/>
+              <w:right w:val="single" w:color="999999" w:sz="4"/>
+            </w:tcBorders>
+            <w:tcMar>
+              <w:top w:type="dxa" w:w="60"/>
+              <w:left w:type="dxa" w:w="100"/>
+              <w:bottom w:type="dxa" w:w="60"/>
+              <w:right w:type="dxa" w:w="100"/>
+            </w:tcMar>
+          </w:tcPr>
+          <w:p>
+            <w:r>
+              <w:rPr>
+                <w:rFonts w:ascii="Calibri" w:cs="Calibri" w:eastAsia="Calibri" w:hAnsi="Calibri"/>
+                <w:b w:val="false"/>
+                <w:bCs w:val="false"/>
+                <w:sz w:val="18"/>
+                <w:szCs w:val="18"/>
+              </w:rPr>
+              <w:t xml:space="preserve">ProofOfDelivery.notes was not set by confirmDelivery() and is not part of FR-15</w:t>
+            </w:r>
+          </w:p>
+        </w:tc>
+        <w:tc>
+          <w:tcPr>
+            <w:tcW w:type="dxa" w:w="2600"/>
+            <w:tcBorders>
+              <w:top w:val="single" w:color="999999" w:sz="4"/>
+              <w:left w:val="single" w:color="999999" w:sz="4"/>
+              <w:bottom w:val="single" w:color="999999" w:sz="4"/>
+              <w:right w:val="single" w:color="999999" w:sz="4"/>
+            </w:tcBorders>
+            <w:tcMar>
+              <w:top w:type="dxa" w:w="60"/>
+              <w:left w:type="dxa" w:w="100"/>
+              <w:bottom w:type="dxa" w:w="60"/>
+              <w:right w:type="dxa" w:w="100"/>
+            </w:tcMar>
+          </w:tcPr>
+          <w:p>
+            <w:r>
+              <w:rPr>
+                <w:rFonts w:ascii="Calibri" w:cs="Calibri" w:eastAsia="Calibri" w:hAnsi="Calibri"/>
+                <w:b/>
+                <w:bCs/>
+                <w:sz w:val="18"/>
+                <w:szCs w:val="18"/>
+              </w:rPr>
+              <w:t xml:space="preserve">Removed</w:t>
+            </w:r>
+            <w:r>
+              <w:rPr>
+                <w:rFonts w:ascii="Calibri" w:cs="Calibri" w:eastAsia="Calibri" w:hAnsi="Calibri"/>
+                <w:b w:val="false"/>
+                <w:bCs w:val="false"/>
+                <w:sz w:val="18"/>
+                <w:szCs w:val="18"/>
+              </w:rPr>
+              <w:t xml:space="preserve"> in the consolidated diagram</w:t>
+            </w:r>
+          </w:p>
+        </w:tc>
+        <w:tc>
+          <w:tcPr>
+            <w:tcW w:type="dxa" w:w="3526"/>
+            <w:tcBorders>
+              <w:top w:val="single" w:color="999999" w:sz="4"/>
+              <w:left w:val="single" w:color="999999" w:sz="4"/>
+              <w:bottom w:val="single" w:color="999999" w:sz="4"/>
+              <w:right w:val="single" w:color="999999" w:sz="4"/>
+            </w:tcBorders>
+            <w:tcMar>
+              <w:top w:type="dxa" w:w="60"/>
+              <w:left w:type="dxa" w:w="100"/>
+              <w:bottom w:type="dxa" w:w="60"/>
+              <w:right w:type="dxa" w:w="100"/>
+            </w:tcMar>
+          </w:tcPr>
+          <w:p>
+            <w:r>
+              <w:rPr>
+                <w:rFonts w:ascii="Calibri" w:cs="Calibri" w:eastAsia="Calibri" w:hAnsi="Calibri"/>
+                <w:b w:val="false"/>
+                <w:bCs w:val="false"/>
+                <w:sz w:val="18"/>
+                <w:szCs w:val="18"/>
+              </w:rPr>
+              <w:t xml:space="preserve">Proof of delivery is exactly name, signature and Emirates ID (FR-15); an attribute nothing sets would always be empty.</w:t>
             </w:r>
           </w:p>
         </w:tc>
@@ -10530,31 +10872,6 @@
           <w:szCs w:val="20"/>
         </w:rPr>
         <w:t xml:space="preserve">Table 2.3: Conflicting design decisions</w:t>
-      </w:r>
-    </w:p>
-    <w:p>
-      <w:pPr>
-        <w:pStyle w:val="Heading2"/>
-        <w:spacing w:after="100" w:before="200"/>
-      </w:pPr>
-      <w:r>
-        <w:rPr>
-          <w:rFonts w:ascii="Calibri" w:cs="Calibri" w:eastAsia="Calibri" w:hAnsi="Calibri"/>
-        </w:rPr>
-        <w:t xml:space="preserve">2.3.1 Tidy-ups to the individual diagrams</w:t>
-      </w:r>
-    </w:p>
-    <w:p>
-      <w:pPr>
-        <w:spacing w:after="120"/>
-      </w:pPr>
-      <w:r>
-        <w:rPr>
-          <w:rFonts w:ascii="Calibri" w:cs="Calibri" w:eastAsia="Calibri" w:hAnsi="Calibri"/>
-          <w:sz w:val="22"/>
-          <w:szCs w:val="22"/>
-        </w:rPr>
-        <w:t xml:space="preserve">During integration some small presentation fixes were made to the individual diagrams so they meet the lab's notation requirements (titles with name and ID, multiplicities at line ends, notes attached to their classes, typos). The classes and design in each member's model were not changed. The full list is in Integration_Notes.md.</w:t>
       </w:r>
     </w:p>
     <w:p>
@@ -10667,6 +10984,31 @@
     </w:p>
     <w:p>
       <w:pPr>
+        <w:pStyle w:val="Heading2"/>
+        <w:spacing w:after="100" w:before="200"/>
+      </w:pPr>
+      <w:r>
+        <w:rPr>
+          <w:rFonts w:ascii="Calibri" w:cs="Calibri" w:eastAsia="Calibri" w:hAnsi="Calibri"/>
+        </w:rPr>
+        <w:t xml:space="preserve">2.5 Tidy-ups to the Individual Diagrams</w:t>
+      </w:r>
+    </w:p>
+    <w:p>
+      <w:pPr>
+        <w:spacing w:after="120"/>
+      </w:pPr>
+      <w:r>
+        <w:rPr>
+          <w:rFonts w:ascii="Calibri" w:cs="Calibri" w:eastAsia="Calibri" w:hAnsi="Calibri"/>
+          <w:sz w:val="22"/>
+          <w:szCs w:val="22"/>
+        </w:rPr>
+        <w:t xml:space="preserve">During integration some small presentation fixes were made to the individual diagrams so they meet the lab's notation requirements (titles with name and ID, multiplicities at line ends, notes attached to their classes, typos). The classes and design in each member's model were not changed. The full list is in Integration_Notes.md.</w:t>
+      </w:r>
+    </w:p>
+    <w:p>
+      <w:pPr>
         <w:pStyle w:val="Heading1"/>
         <w:spacing w:after="120" w:before="240"/>
       </w:pPr>
@@ -11053,7 +11395,7 @@
                 <w:sz w:val="19"/>
                 <w:szCs w:val="19"/>
               </w:rPr>
-              <w:t xml:space="preserve">UC-01, UC-03, UC-05</w:t>
+              <w:t xml:space="preserve">UC-01, UC-03, UC-05, UC-19</w:t>
             </w:r>
           </w:p>
         </w:tc>
@@ -11082,7 +11424,7 @@
                 <w:sz w:val="19"/>
                 <w:szCs w:val="19"/>
               </w:rPr>
-              <w:t xml:space="preserve">FR-01, FR-03, FR-05</w:t>
+              <w:t xml:space="preserve">FR-01, FR-03, FR-05, FR-19</w:t>
             </w:r>
           </w:p>
         </w:tc>
@@ -11174,7 +11516,7 @@
                 <w:sz w:val="19"/>
                 <w:szCs w:val="19"/>
               </w:rPr>
-              <w:t xml:space="preserve">UC-03, UC-04, UC-05, UC-14, UC-19, UC-21</w:t>
+              <w:t xml:space="preserve">UC-03, UC-04, UC-05, UC-14, UC-15, UC-19, UC-21</w:t>
             </w:r>
           </w:p>
         </w:tc>
@@ -11203,7 +11545,7 @@
                 <w:sz w:val="19"/>
                 <w:szCs w:val="19"/>
               </w:rPr>
-              <w:t xml:space="preserve">FR-03, FR-04, FR-05, FR-13, FR-14, FR-19</w:t>
+              <w:t xml:space="preserve">FR-03, FR-04, FR-05, FR-13, FR-14, FR-18, FR-19</w:t>
             </w:r>
           </w:p>
         </w:tc>
@@ -12171,7 +12513,7 @@
                 <w:sz w:val="19"/>
                 <w:szCs w:val="19"/>
               </w:rPr>
-              <w:t xml:space="preserve">FR-13</w:t>
+              <w:t xml:space="preserve">FR-13, FR-14, FR-15</w:t>
             </w:r>
           </w:p>
         </w:tc>
@@ -13202,7 +13544,7 @@
                 <w:sz w:val="18"/>
                 <w:szCs w:val="18"/>
               </w:rPr>
-              <w:t xml:space="preserve">Added Administrator.reassignParcel(parcel: Parcel, staff: FieldStaff): Assignment. "contains" stays 0..1 on the Assignment side because a parcel belongs to at most one current assignment; reassigning moves it to a new one before pickup (shown in a note)</w:t>
+              <w:t xml:space="preserve">Added Administrator.reassignParcel(parcel: Parcel, staff: FieldStaff): Assignment. "contains" stays 0..1 on the Assignment side because a parcel belongs to at most one current assignment; reassigning moves it to a new one before pickup. An assignment whose last parcel is reassigned is cancelled, so no assignment is left with 0 parcels and "1..*" still holds (shown in a note)</w:t>
             </w:r>
           </w:p>
         </w:tc>
@@ -13711,7 +14053,7 @@
                 <w:sz w:val="19"/>
                 <w:szCs w:val="19"/>
               </w:rPr>
-              <w:t xml:space="preserve">Yes, by design. A notification only exists in the notification service's outgoing queue until it is sent or its 24-hour retry window ends (NFR-18), and its ID identifies it while it is queued. A DelayAlert is rebuilt from D2 (undelivered, last status change over 48 hours ago). Neither needs a permanent store; a D4 Notifications store would be added only if a notification history were required (see Integration_Notes.md).</w:t>
+              <w:t xml:space="preserve">Yes, by design. A notification only exists in the notification service's outgoing queue until it is sent or its 24-hour retry window ends (NFR-18), and its ID identifies it while it is queued. A DelayAlert only lives on the admin dashboard while it is active (its ID identifies it there, and resolve() clears it at the next real status update), and it can always be rebuilt from D2 (undelivered, last status change over 48 hours ago). Neither needs a permanent store; a D4 Notifications store would be added only if a notification history were required (see Integration_Notes.md).</w:t>
             </w:r>
           </w:p>
         </w:tc>

</xml_diff>

<commit_message>
Polish: decision wording, arrow directions, ID ranges, diagram labels
</commit_message>
<xml_diff>
--- a/Documents/COE420_Lab5_Team10.docx
+++ b/Documents/COE420_Lab5_Team10.docx
@@ -517,7 +517,7 @@
           <w:sz w:val="22"/>
           <w:szCs w:val="22"/>
         </w:rPr>
-        <w:t xml:space="preserve">Each member first modeled the part of the system they owned in Labs 3 and 4, then the team merged the four models into one consolidated class diagram. Every member pushed their own work to the shared GitHub repository, and the final integration fixes were committed together at the end.</w:t>
+        <w:t xml:space="preserve">Each member first modeled the part of the system they owned in Labs 3 and 4, then the team merged the four models into one consolidated class diagram. Every member pushed their own work to the shared GitHub repository, and the final integration fixes were committed by Sarhan after the team reviewed them.</w:t>
       </w:r>
     </w:p>
     <w:tbl>
@@ -1023,7 +1023,7 @@
           <w:sz w:val="22"/>
           <w:szCs w:val="22"/>
         </w:rPr>
-        <w:t xml:space="preserve">Each member identified the classes for their own area (Exercise 1) and drew an individual UML class diagram in draw.io (Exercise 2). Each diagram focuses on the member's own classes and also shows the classes it links to from other members, as name-only reference boxes (Kevin's diagram shows full copies of the customer-side classes for context). Class IDs use fixed ranges per member (C01-C04, C06-C08, C11-C14, C16-C20) so they stay unique when merged.</w:t>
+        <w:t xml:space="preserve">Each member identified the classes for their own area (Exercise 1) and drew an individual UML class diagram in draw.io (Exercise 2). Each diagram focuses on the member's own classes and also shows the classes it links to from other members, as name-only reference boxes (Kevin's diagram shows full copies of the customer-side classes for context). Each member was given a fixed block of class IDs (C01-C05, C06-C10, C11-C15 and C16-C20) so IDs stay unique when merged; C05, C09, C10 and C15 were not needed.</w:t>
       </w:r>
     </w:p>
     <w:p>
@@ -9291,7 +9291,7 @@
                 <w:sz w:val="18"/>
                 <w:szCs w:val="18"/>
               </w:rPr>
-              <w:t xml:space="preserve">Same double-modelling as decision 2. The attribute types already show the link to ParcelStatus.</w:t>
+              <w:t xml:space="preserve">Same double-modeling as decision 2. The attribute types already show the link to ParcelStatus.</w:t>
             </w:r>
           </w:p>
         </w:tc>
@@ -9888,7 +9888,7 @@
                 <w:sz w:val="18"/>
                 <w:szCs w:val="18"/>
               </w:rPr>
-              <w:t xml:space="preserve">Kevin's «use» dependencies from Administrator to FieldStaff, Zone, Parcel and DelayAlert</w:t>
+              <w:t xml:space="preserve">Kevin's first merged draft (Oct 26) had «use» dependencies from Administrator to FieldStaff, Zone, Parcel and DelayAlert (his individual diagram has the ones to FieldStaff and Zone)</w:t>
             </w:r>
           </w:p>
         </w:tc>
@@ -9927,7 +9927,7 @@
                 <w:sz w:val="18"/>
                 <w:szCs w:val="18"/>
               </w:rPr>
-              <w:t xml:space="preserve"> in the consolidated diagram</w:t>
+              <w:t xml:space="preserve"> in the consolidated diagram, except Parcel «use» ParcelStatus</w:t>
             </w:r>
           </w:p>
         </w:tc>
@@ -9956,7 +9956,7 @@
                 <w:sz w:val="18"/>
                 <w:szCs w:val="18"/>
               </w:rPr>
-              <w:t xml:space="preserve">They only repeat types that are already visible in the method signatures, and drawing them crossed most of the diagram. The only dependency kept is Parcel «use» ParcelStatus.</w:t>
+              <w:t xml:space="preserve">The Administrator dependencies only repeat types already visible in its method signatures, and drawing them crossed most of the diagram. Parcel «use» ParcelStatus is kept so the enumeration is visibly connected to the class that uses it rather than left as a disconnected box.</w:t>
             </w:r>
           </w:p>
         </w:tc>
@@ -10019,7 +10019,7 @@
                 <w:sz w:val="18"/>
                 <w:szCs w:val="18"/>
               </w:rPr>
-              <w:t xml:space="preserve">ProofOfDelivery used a proof image (proofImagePath), and a leftover recievedByName (sic) attribute</w:t>
+              <w:t xml:space="preserve">Hammad's first draft of ProofOfDelivery used a proof image (proofImagePath), and Kevin's first merged draft still had a leftover recievedByName (sic) attribute</w:t>
             </w:r>
           </w:p>
         </w:tc>
@@ -10097,7 +10097,7 @@
                 <w:sz w:val="18"/>
                 <w:szCs w:val="18"/>
               </w:rPr>
-              <w:t xml:space="preserve">This was fixed in Lab 3 after instructor feedback (FR-15).</w:t>
+              <w:t xml:space="preserve">Proof of delivery was defined as name, signature and Emirates ID when Lab 3 was fixed after instructor feedback (FR-15); the drafts were brought in line before the final merge.</w:t>
             </w:r>
           </w:p>
         </w:tc>
@@ -10441,47 +10441,7 @@
                 <w:sz w:val="18"/>
                 <w:szCs w:val="18"/>
               </w:rPr>
-              <w:t xml:space="preserve">In the consolidated diagram, standardised to </w:t>
-            </w:r>
-            <w:r>
-              <w:rPr>
-                <w:rFonts w:ascii="Calibri" w:cs="Calibri" w:eastAsia="Calibri" w:hAnsi="Calibri"/>
-                <w:b/>
-                <w:bCs/>
-                <w:sz w:val="18"/>
-                <w:szCs w:val="18"/>
-              </w:rPr>
-              <w:t xml:space="preserve">...Id</w:t>
-            </w:r>
-            <w:r>
-              <w:rPr>
-                <w:rFonts w:ascii="Calibri" w:cs="Calibri" w:eastAsia="Calibri" w:hAnsi="Calibri"/>
-                <w:b w:val="false"/>
-                <w:bCs w:val="false"/>
-                <w:sz w:val="18"/>
-                <w:szCs w:val="18"/>
-              </w:rPr>
-              <w:t xml:space="preserve"> for every ID attribute and </w:t>
-            </w:r>
-            <w:r>
-              <w:rPr>
-                <w:rFonts w:ascii="Calibri" w:cs="Calibri" w:eastAsia="Calibri" w:hAnsi="Calibri"/>
-                <w:b/>
-                <w:bCs/>
-                <w:sz w:val="18"/>
-                <w:szCs w:val="18"/>
-              </w:rPr>
-              <w:t xml:space="preserve">0..</w:t>
-            </w:r>
-            <w:r>
-              <w:rPr>
-                <w:rFonts w:ascii="Calibri" w:cs="Calibri" w:eastAsia="Calibri" w:hAnsi="Calibri"/>
-                <w:b w:val="false"/>
-                <w:bCs w:val="false"/>
-                <w:sz w:val="18"/>
-                <w:szCs w:val="18"/>
-              </w:rPr>
-              <w:t xml:space="preserve">* for every "many" multiplicity</w:t>
+              <w:t xml:space="preserve">In the consolidated diagram, standardized to ...Id for every ID attribute and 0..* for every "many" multiplicity</w:t>
             </w:r>
           </w:p>
         </w:tc>
@@ -10873,17 +10833,6 @@
         </w:rPr>
         <w:t xml:space="preserve">Table 2.3: Conflicting design decisions</w:t>
       </w:r>
-    </w:p>
-    <w:p>
-      <w:pPr>
-        <w:sectPr>
-          <w:footerReference w:type="default" r:id="rId7"/>
-          <w:pgSz w:w="11906" w:h="16838" w:orient="portrait"/>
-          <w:pgMar w:top="1440" w:right="1440" w:bottom="1440" w:left="1440" w:header="708" w:footer="708" w:gutter="0"/>
-          <w:pgNumType/>
-          <w:docGrid w:linePitch="360"/>
-        </w:sectPr>
-      </w:pPr>
     </w:p>
     <w:p>
       <w:pPr>
@@ -10907,8 +10856,19 @@
           <w:sz w:val="22"/>
           <w:szCs w:val="22"/>
         </w:rPr>
-        <w:t xml:space="preserve">The consolidated diagram combines all 16 classes in one coherent model. It shows attributes, methods, visibility, data types, parameters and return types, named associations with multiplicities at both ends, the two inheritance hierarchies (User and Notification), the Parcel-Recipient composition and UML notes for the main rules. «use» dependencies that only repeat types already shown in method signatures are left out for readability; the one kept is Parcel «use» ParcelStatus.</w:t>
+        <w:t xml:space="preserve">Figure 2.1 on the next page shows the consolidated diagram. It combines all 16 classes in one coherent model. It shows attributes, methods, visibility, data types, parameters and return types, named associations with multiplicities at both ends, the two inheritance hierarchies (User and Notification), the Parcel-Recipient composition and UML notes for the main rules. «use» dependencies that only repeat types already shown in method signatures are left out for readability; the one kept is Parcel «use» ParcelStatus.</w:t>
       </w:r>
+    </w:p>
+    <w:p>
+      <w:pPr>
+        <w:sectPr>
+          <w:footerReference w:type="default" r:id="rId7"/>
+          <w:pgSz w:w="11906" w:h="16838" w:orient="portrait"/>
+          <w:pgMar w:top="1440" w:right="1440" w:bottom="1440" w:left="1440" w:header="708" w:footer="708" w:gutter="0"/>
+          <w:pgNumType/>
+          <w:docGrid w:linePitch="360"/>
+        </w:sectPr>
+      </w:pPr>
     </w:p>
     <w:p>
       <w:pPr>
@@ -10917,7 +10877,7 @@
       <w:r>
         <w:drawing>
           <wp:inline distT="0" distB="0" distL="0" distR="0">
-            <wp:extent cx="6381750" cy="4191000"/>
+            <wp:extent cx="8210550" cy="5334000"/>
             <wp:effectExtent t="0" r="0" b="0" l="0"/>
             <wp:docPr id="1" name="" descr="" title=""/>
             <wp:cNvGraphicFramePr>
@@ -10942,7 +10902,7 @@
                   <pic:spPr bwMode="auto">
                     <a:xfrm>
                       <a:off x="0" y="0"/>
-                      <a:ext cx="6381750" cy="4191000"/>
+                      <a:ext cx="8210550" cy="5334000"/>
                     </a:xfrm>
                     <a:prstGeom prst="rect">
                       <a:avLst/>
@@ -12997,7 +12957,7 @@
                 <w:sz w:val="19"/>
                 <w:szCs w:val="19"/>
               </w:rPr>
-              <w:t xml:space="preserve">FR-17, FR-09</w:t>
+              <w:t xml:space="preserve">FR-09, FR-17</w:t>
             </w:r>
           </w:p>
         </w:tc>
@@ -13544,7 +13504,7 @@
                 <w:sz w:val="18"/>
                 <w:szCs w:val="18"/>
               </w:rPr>
-              <w:t xml:space="preserve">Added Administrator.reassignParcel(parcel: Parcel, staff: FieldStaff): Assignment. "contains" stays 0..1 on the Assignment side because a parcel belongs to at most one current assignment; reassigning moves it to a new one before pickup. An assignment whose last parcel is reassigned is cancelled, so no assignment is left with 0 parcels and "1..*" still holds (shown in a note)</w:t>
+              <w:t xml:space="preserve">Added Administrator.reassignParcel(parcel: Parcel, staff: FieldStaff): Assignment. "contains" stays 0..1 on the Assignment side because a parcel belongs to at most one current assignment; reassigning moves it to a new one before pickup. An assignment whose last parcel is reassigned is removed, so no assignment is left with 0 parcels and "1..*" still holds (shown in a note)</w:t>
             </w:r>
           </w:p>
         </w:tc>
@@ -16672,7 +16632,7 @@
           <w:sz w:val="22"/>
           <w:szCs w:val="22"/>
         </w:rPr>
-        <w:t xml:space="preserve">Each member committed their own individual model, inventory and team task under their own GitHub account. The final integration fixes listed in Integration_Notes.md (diagram tidy-ups, file moves and the consolidated diagram clean-up) were committed together by Sarhan on October 27.</w:t>
+        <w:t xml:space="preserve">Each member committed their own individual model, inventory and team task under their own GitHub account. The final integration fixes listed in Integration_Notes.md (diagram tidy-ups, file moves and the consolidated diagram clean-up) were committed by Sarhan on October 27 after the team reviewed them.</w:t>
       </w:r>
     </w:p>
     <w:p>

</xml_diff>

<commit_message>
Store delay alerts in D2, summary notification 0..1, small wording fixes
</commit_message>
<xml_diff>
--- a/Documents/COE420_Lab5_Team10.docx
+++ b/Documents/COE420_Lab5_Team10.docx
@@ -487,7 +487,7 @@
           <w:sz w:val="22"/>
           <w:szCs w:val="22"/>
         </w:rPr>
-        <w:t xml:space="preserve">Fall 2026, October 27, 2026</w:t>
+        <w:t xml:space="preserve">Fall 2026, October 27</w:t>
       </w:r>
     </w:p>
     <w:p>
@@ -10412,7 +10412,7 @@
                 <w:sz w:val="18"/>
                 <w:szCs w:val="18"/>
               </w:rPr>
-              <w:t xml:space="preserve">Naming differed between members (notificationID vs userId, * vs 0..*)</w:t>
+              <w:t xml:space="preserve">Naming differed between members in the original drafts (notificationID vs userId, * vs 0..*)</w:t>
             </w:r>
           </w:p>
         </w:tc>
@@ -10813,6 +10813,147 @@
                 <w:szCs w:val="18"/>
               </w:rPr>
               <w:t xml:space="preserve">Proof of delivery is exactly name, signature and Emirates ID (FR-15); an attribute nothing sets would always be empty.</w:t>
+            </w:r>
+          </w:p>
+        </w:tc>
+      </w:tr>
+      <w:tr>
+        <w:trPr>
+          <w:tblHeader w:val="false"/>
+        </w:trPr>
+        <w:tc>
+          <w:tcPr>
+            <w:tcW w:type="dxa" w:w="400"/>
+            <w:tcBorders>
+              <w:top w:val="single" w:color="999999" w:sz="4"/>
+              <w:left w:val="single" w:color="999999" w:sz="4"/>
+              <w:bottom w:val="single" w:color="999999" w:sz="4"/>
+              <w:right w:val="single" w:color="999999" w:sz="4"/>
+            </w:tcBorders>
+            <w:tcMar>
+              <w:top w:type="dxa" w:w="60"/>
+              <w:left w:type="dxa" w:w="100"/>
+              <w:bottom w:type="dxa" w:w="60"/>
+              <w:right w:type="dxa" w:w="100"/>
+            </w:tcMar>
+          </w:tcPr>
+          <w:p>
+            <w:r>
+              <w:rPr>
+                <w:rFonts w:ascii="Calibri" w:cs="Calibri" w:eastAsia="Calibri" w:hAnsi="Calibri"/>
+                <w:b w:val="false"/>
+                <w:bCs w:val="false"/>
+                <w:sz w:val="18"/>
+                <w:szCs w:val="18"/>
+              </w:rPr>
+              <w:t xml:space="preserve">15</w:t>
+            </w:r>
+          </w:p>
+        </w:tc>
+        <w:tc>
+          <w:tcPr>
+            <w:tcW w:type="dxa" w:w="2500"/>
+            <w:tcBorders>
+              <w:top w:val="single" w:color="999999" w:sz="4"/>
+              <w:left w:val="single" w:color="999999" w:sz="4"/>
+              <w:bottom w:val="single" w:color="999999" w:sz="4"/>
+              <w:right w:val="single" w:color="999999" w:sz="4"/>
+            </w:tcBorders>
+            <w:tcMar>
+              <w:top w:type="dxa" w:w="60"/>
+              <w:left w:type="dxa" w:w="100"/>
+              <w:bottom w:type="dxa" w:w="60"/>
+              <w:right w:type="dxa" w:w="100"/>
+            </w:tcMar>
+          </w:tcPr>
+          <w:p>
+            <w:r>
+              <w:rPr>
+                <w:rFonts w:ascii="Calibri" w:cs="Calibri" w:eastAsia="Calibri" w:hAnsi="Calibri"/>
+                <w:b w:val="false"/>
+                <w:bCs w:val="false"/>
+                <w:sz w:val="18"/>
+                <w:szCs w:val="18"/>
+              </w:rPr>
+              <w:t xml:space="preserve">Ahmed's model had exactly 1 AssignmentNotification per Assignment</w:t>
+            </w:r>
+          </w:p>
+        </w:tc>
+        <w:tc>
+          <w:tcPr>
+            <w:tcW w:type="dxa" w:w="2600"/>
+            <w:tcBorders>
+              <w:top w:val="single" w:color="999999" w:sz="4"/>
+              <w:left w:val="single" w:color="999999" w:sz="4"/>
+              <w:bottom w:val="single" w:color="999999" w:sz="4"/>
+              <w:right w:val="single" w:color="999999" w:sz="4"/>
+            </w:tcBorders>
+            <w:tcMar>
+              <w:top w:type="dxa" w:w="60"/>
+              <w:left w:type="dxa" w:w="100"/>
+              <w:bottom w:type="dxa" w:w="60"/>
+              <w:right w:type="dxa" w:w="100"/>
+            </w:tcMar>
+          </w:tcPr>
+          <w:p>
+            <w:r>
+              <w:rPr>
+                <w:rFonts w:ascii="Calibri" w:cs="Calibri" w:eastAsia="Calibri" w:hAnsi="Calibri"/>
+                <w:b w:val="false"/>
+                <w:bCs w:val="false"/>
+                <w:sz w:val="18"/>
+                <w:szCs w:val="18"/>
+              </w:rPr>
+              <w:t xml:space="preserve">Changed to </w:t>
+            </w:r>
+            <w:r>
+              <w:rPr>
+                <w:rFonts w:ascii="Calibri" w:cs="Calibri" w:eastAsia="Calibri" w:hAnsi="Calibri"/>
+                <w:b/>
+                <w:bCs/>
+                <w:sz w:val="18"/>
+                <w:szCs w:val="18"/>
+              </w:rPr>
+              <w:t xml:space="preserve">0..1</w:t>
+            </w:r>
+            <w:r>
+              <w:rPr>
+                <w:rFonts w:ascii="Calibri" w:cs="Calibri" w:eastAsia="Calibri" w:hAnsi="Calibri"/>
+                <w:b w:val="false"/>
+                <w:bCs w:val="false"/>
+                <w:sz w:val="18"/>
+                <w:szCs w:val="18"/>
+              </w:rPr>
+              <w:t xml:space="preserve"> at the notification end in the consolidated diagram</w:t>
+            </w:r>
+          </w:p>
+        </w:tc>
+        <w:tc>
+          <w:tcPr>
+            <w:tcW w:type="dxa" w:w="3526"/>
+            <w:tcBorders>
+              <w:top w:val="single" w:color="999999" w:sz="4"/>
+              <w:left w:val="single" w:color="999999" w:sz="4"/>
+              <w:bottom w:val="single" w:color="999999" w:sz="4"/>
+              <w:right w:val="single" w:color="999999" w:sz="4"/>
+            </w:tcBorders>
+            <w:tcMar>
+              <w:top w:type="dxa" w:w="60"/>
+              <w:left w:type="dxa" w:w="100"/>
+              <w:bottom w:type="dxa" w:w="60"/>
+              <w:right w:type="dxa" w:w="100"/>
+            </w:tcMar>
+          </w:tcPr>
+          <w:p>
+            <w:r>
+              <w:rPr>
+                <w:rFonts w:ascii="Calibri" w:cs="Calibri" w:eastAsia="Calibri" w:hAnsi="Calibri"/>
+                <w:b w:val="false"/>
+                <w:bCs w:val="false"/>
+                <w:sz w:val="18"/>
+                <w:szCs w:val="18"/>
+              </w:rPr>
+              <w:t xml:space="preserve">The summary is only created when confirmAssignment() runs and only exists until it is sent, while the Assignment is kept permanently in D2, so an assignment has a summary at most some of the time.</w:t>
             </w:r>
           </w:p>
         </w:tc>
@@ -13800,7 +13941,7 @@
                 <w:sz w:val="19"/>
                 <w:szCs w:val="19"/>
               </w:rPr>
-              <w:t xml:space="preserve">Parcel, Recipient, Assignment, ProofOfDelivery, DeliveryAttempt</w:t>
+              <w:t xml:space="preserve">Parcel, Recipient, Assignment, ProofOfDelivery, DeliveryAttempt, DelayAlert</w:t>
             </w:r>
           </w:p>
         </w:tc>
@@ -13829,7 +13970,7 @@
                 <w:sz w:val="19"/>
                 <w:szCs w:val="19"/>
               </w:rPr>
-              <w:t xml:space="preserve">Yes. Lab 4 does not say where attempts are stored, so they sit with the parcel record.</w:t>
+              <w:t xml:space="preserve">Yes. Delivery attempts and delay alerts (active or resolved) are kept with the parcel record, as the updated D2 description in Lab 4 says.</w:t>
             </w:r>
           </w:p>
         </w:tc>
@@ -13984,7 +14125,7 @@
                 <w:sz w:val="19"/>
                 <w:szCs w:val="19"/>
               </w:rPr>
-              <w:t xml:space="preserve">Notification, StatusNotification, AssignmentNotification, DelayAlert</w:t>
+              <w:t xml:space="preserve">Notification, StatusNotification, AssignmentNotification</w:t>
             </w:r>
           </w:p>
         </w:tc>
@@ -14013,7 +14154,7 @@
                 <w:sz w:val="19"/>
                 <w:szCs w:val="19"/>
               </w:rPr>
-              <w:t xml:space="preserve">Yes, by design. A notification only exists in the notification service's outgoing queue until it is sent or its 24-hour retry window ends (NFR-18), and its ID identifies it while it is queued. A DelayAlert only lives on the admin dashboard while it is active (its ID identifies it there, and resolve() clears it at the next real status update), and it can always be rebuilt from D2 (undelivered, last status change over 48 hours ago). Neither needs a permanent store; a D4 Notifications store would be added only if a notification history were required (see Integration_Notes.md).</w:t>
+              <w:t xml:space="preserve">Yes, by design. A notification only exists in the notification service's outgoing queue until it is sent or its 24-hour retry window ends (NFR-18), and its ID identifies it while it is queued. Nothing in the requirements asks for sent notifications to be kept, so they need no permanent store; a D4 Notifications store would be added only if a notification history were required (see Integration_Notes.md).</w:t>
             </w:r>
           </w:p>
         </w:tc>
@@ -15216,7 +15357,7 @@
                 <w:sz w:val="18"/>
                 <w:szCs w:val="18"/>
               </w:rPr>
-              <w:t xml:space="preserve">1 to 1</w:t>
+              <w:t xml:space="preserve">0..1 to 1</w:t>
             </w:r>
           </w:p>
         </w:tc>
@@ -15274,7 +15415,7 @@
                 <w:sz w:val="18"/>
                 <w:szCs w:val="18"/>
               </w:rPr>
-              <w:t xml:space="preserve">One summary per bulk assignment</w:t>
+              <w:t xml:space="preserve">At most one summary per assignment; it exists from confirmAssignment() until it is sent (decision 15)</w:t>
             </w:r>
           </w:p>
         </w:tc>
@@ -16464,6 +16605,34 @@
           <w:szCs w:val="22"/>
         </w:rPr>
         <w:t xml:space="preserve"> brought the Core Processes Matrix rules (P1-P5) and the D1/D2 data store descriptions in line with the fixed Lab 3 requirements and this class model (zones set by the admin, booking validation and delivery window, Delayed rule, Attempted with max 3 attempts then Returned to Sender, standard status names).</w:t>
+      </w:r>
+    </w:p>
+    <w:p>
+      <w:pPr>
+        <w:pStyle w:val="ListParagraph"/>
+        <w:numPr>
+          <w:ilvl w:val="0"/>
+          <w:numId w:val="2"/>
+        </w:numPr>
+        <w:spacing w:after="60"/>
+      </w:pPr>
+      <w:r>
+        <w:rPr>
+          <w:rFonts w:ascii="Calibri" w:cs="Calibri" w:eastAsia="Calibri" w:hAnsi="Calibri"/>
+          <w:b/>
+          <w:bCs/>
+          <w:sz w:val="22"/>
+          <w:szCs w:val="22"/>
+        </w:rPr>
+        <w:t xml:space="preserve">Lab 4 (Oct 27):</w:t>
+      </w:r>
+      <w:r>
+        <w:rPr>
+          <w:rFonts w:ascii="Calibri" w:cs="Calibri" w:eastAsia="Calibri" w:hAnsi="Calibri"/>
+          <w:sz w:val="22"/>
+          <w:szCs w:val="22"/>
+        </w:rPr>
+        <w:t xml:space="preserve"> the D2 Parcels data store description also covers delay alerts, matching the DelayAlert class.</w:t>
       </w:r>
     </w:p>
     <w:p>

</xml_diff>